<commit_message>
feat(init): add tag + run inherit from parent
</commit_message>
<xml_diff>
--- a/test/assets/index.docx
+++ b/test/assets/index.docx
@@ -139,7 +139,255 @@
       <w:r>
         <w:t xml:space="preserve">
   Helloword 2
+  </w:t>
+      </w:r>
+      <w:r>
+        <w:rPr>
+          <w:b/>
+          <w:bCs/>
+        </w:rPr>
+        <w:r>
+          <w:rPr>
+            <w:b/>
+            <w:bCs/>
+          </w:rPr>
+          <w:t xml:space="preserve">bold with b</w:t>
+        </w:r>
+      </w:r>
+      <w:r>
+        <w:t xml:space="preserve">
+  </w:t>
+      </w:r>
+      <w:r>
+        <w:rPr>
+          <w:b/>
+          <w:bCs/>
+        </w:rPr>
+        <w:r>
+          <w:rPr>
+            <w:b/>
+            <w:bCs/>
+          </w:rPr>
+          <w:t xml:space="preserve">bold with strong</w:t>
+        </w:r>
+      </w:r>
+      <w:r>
+        <w:t xml:space="preserve">
+  </w:t>
+      </w:r>
+      <w:r>
+        <w:rPr>
+          <w:i/>
+          <w:iCs/>
+        </w:rPr>
+        <w:r>
+          <w:rPr>
+            <w:i/>
+            <w:iCs/>
+          </w:rPr>
+          <w:t xml:space="preserve">italic with i</w:t>
+        </w:r>
+      </w:r>
+      <w:r>
+        <w:t xml:space="preserve">
+  </w:t>
+      </w:r>
+      <w:r>
+        <w:rPr>
+          <w:i/>
+          <w:iCs/>
+        </w:rPr>
+        <w:r>
+          <w:rPr>
+            <w:i/>
+            <w:iCs/>
+          </w:rPr>
+          <w:t xml:space="preserve">italic with em</w:t>
+        </w:r>
+      </w:r>
+      <w:r>
+        <w:t xml:space="preserve">
+  </w:t>
+      </w:r>
+      <w:r>
+        <w:rPr>
+          <w:u w:val="single" w:color="auto"/>
+        </w:rPr>
+        <w:r>
+          <w:rPr>
+            <w:u w:val="single" w:color="auto"/>
+          </w:rPr>
+          <w:t xml:space="preserve">underline with u</w:t>
+        </w:r>
+      </w:r>
+      <w:r>
+        <w:t xml:space="preserve">
+  </w:t>
+      </w:r>
+      <w:r>
+        <w:rPr>
+          <w:strike/>
+        </w:rPr>
+        <w:r>
+          <w:rPr>
+            <w:strike/>
+          </w:rPr>
+          <w:t xml:space="preserve">line-through with strike</w:t>
+        </w:r>
+      </w:r>
+      <w:r>
+        <w:t xml:space="preserve">
+  </w:t>
+      </w:r>
+      <w:r>
+        <w:rPr>
+          <w:vertAlign w:val="subscript"/>
+        </w:rPr>
+        <w:r>
+          <w:rPr>
+            <w:vertAlign w:val="subscript"/>
+          </w:rPr>
+          <w:t xml:space="preserve">subscript with sub</w:t>
+        </w:r>
+      </w:r>
+      <w:r>
+        <w:t xml:space="preserve">
+  </w:t>
+      </w:r>
+      <w:r>
+        <w:rPr>
+          <w:vertAlign w:val="superscript"/>
+        </w:rPr>
+        <w:r>
+          <w:rPr>
+            <w:vertAlign w:val="superscript"/>
+          </w:rPr>
+          <w:t xml:space="preserve">superscript with sup</w:t>
+        </w:r>
+      </w:r>
+      <w:r>
+        <w:t xml:space="preserve">
 </w:t>
+      </w:r>
+    </w:p>
+    <w:p>
+      <w:r>
+        <w:rPr>
+          <w:b/>
+          <w:bCs/>
+        </w:rPr>
+        <w:r>
+          <w:rPr>
+            <w:b/>
+            <w:bCs/>
+          </w:rPr>
+          <w:t xml:space="preserve">bold with b</w:t>
+        </w:r>
+        <w:r>
+          <w:rPr>
+            <w:b/>
+            <w:bCs/>
+            <w:i/>
+            <w:iCs/>
+          </w:rPr>
+          <w:r>
+            <w:rPr>
+              <w:b/>
+              <w:bCs/>
+              <w:i/>
+              <w:iCs/>
+            </w:rPr>
+            <w:t xml:space="preserve">italic with i</w:t>
+          </w:r>
+          <w:r>
+            <w:rPr>
+              <w:b/>
+              <w:bCs/>
+              <w:i/>
+              <w:iCs/>
+              <w:u w:val="single" w:color="auto"/>
+            </w:rPr>
+            <w:r>
+              <w:rPr>
+                <w:b/>
+                <w:bCs/>
+                <w:i/>
+                <w:iCs/>
+                <w:u w:val="single" w:color="auto"/>
+              </w:rPr>
+              <w:t xml:space="preserve">underline with u</w:t>
+            </w:r>
+            <w:r>
+              <w:rPr>
+                <w:b/>
+                <w:bCs/>
+                <w:i/>
+                <w:iCs/>
+                <w:strike/>
+                <w:u w:val="single" w:color="auto"/>
+              </w:rPr>
+              <w:r>
+                <w:rPr>
+                  <w:b/>
+                  <w:bCs/>
+                  <w:i/>
+                  <w:iCs/>
+                  <w:strike/>
+                  <w:u w:val="single" w:color="auto"/>
+                </w:rPr>
+                <w:t xml:space="preserve">line-through with strike</w:t>
+              </w:r>
+              <w:r>
+                <w:rPr>
+                  <w:b/>
+                  <w:bCs/>
+                  <w:i/>
+                  <w:iCs/>
+                  <w:strike/>
+                  <w:u w:val="single" w:color="auto"/>
+                  <w:vertAlign w:val="subscript"/>
+                </w:rPr>
+                <w:r>
+                  <w:rPr>
+                    <w:b/>
+                    <w:bCs/>
+                    <w:i/>
+                    <w:iCs/>
+                    <w:strike/>
+                    <w:u w:val="single" w:color="auto"/>
+                    <w:vertAlign w:val="subscript"/>
+                  </w:rPr>
+                  <w:t xml:space="preserve">subscript with sub</w:t>
+                </w:r>
+                <w:r>
+                  <w:rPr>
+                    <w:b/>
+                    <w:bCs/>
+                    <w:i/>
+                    <w:iCs/>
+                    <w:strike/>
+                    <w:color w:val="035312"/>
+                    <w:u w:val="single" w:color="auto"/>
+                    <w:vertAlign w:val="subscript"/>
+                  </w:rPr>
+                  <w:r>
+                    <w:rPr>
+                      <w:b/>
+                      <w:bCs/>
+                      <w:i/>
+                      <w:iCs/>
+                      <w:strike/>
+                      <w:color w:val="035312"/>
+                      <w:u w:val="single" w:color="auto"/>
+                      <w:vertAlign w:val="subscript"/>
+                    </w:rPr>
+                    <w:t xml:space="preserve">color</w:t>
+                  </w:r>
+                </w:r>
+              </w:r>
+            </w:r>
+          </w:r>
+        </w:r>
       </w:r>
     </w:p>
     <w:p>

</xml_diff>

<commit_message>
feat(options): add default run options
</commit_message>
<xml_diff>
--- a/test/assets/index.docx
+++ b/test/assets/index.docx
@@ -3,33 +3,55 @@
 <w:document xmlns:wpc="http://schemas.microsoft.com/office/word/2010/wordprocessingCanvas" xmlns:mc="http://schemas.openxmlformats.org/markup-compatibility/2006" xmlns:o="urn:schemas-microsoft-com:office:office" xmlns:r="http://schemas.openxmlformats.org/officeDocument/2006/relationships" xmlns:m="http://schemas.openxmlformats.org/officeDocument/2006/math" xmlns:v="urn:schemas-microsoft-com:vml" xmlns:wp14="http://schemas.microsoft.com/office/word/2010/wordprocessingDrawing" xmlns:wp="http://schemas.openxmlformats.org/drawingml/2006/wordprocessingDrawing" xmlns:w10="urn:schemas-microsoft-com:office:word" xmlns:w="http://schemas.openxmlformats.org/wordprocessingml/2006/main" xmlns:w14="http://schemas.microsoft.com/office/word/2010/wordml" xmlns:w15="http://schemas.microsoft.com/office/word/2012/wordml" xmlns:wpg="http://schemas.microsoft.com/office/word/2010/wordprocessingGroup" xmlns:wpi="http://schemas.microsoft.com/office/word/2010/wordprocessingInk" xmlns:wne="http://schemas.microsoft.com/office/word/2006/wordml" xmlns:wps="http://schemas.microsoft.com/office/word/2010/wordprocessingShape" xmlns:cx="http://schemas.microsoft.com/office/drawing/2014/chartex" xmlns:cx1="http://schemas.microsoft.com/office/drawing/2015/9/8/chartex" xmlns:cx2="http://schemas.microsoft.com/office/drawing/2015/10/21/chartex" xmlns:cx3="http://schemas.microsoft.com/office/drawing/2016/5/9/chartex" xmlns:cx4="http://schemas.microsoft.com/office/drawing/2016/5/10/chartex" xmlns:cx5="http://schemas.microsoft.com/office/drawing/2016/5/11/chartex" xmlns:cx6="http://schemas.microsoft.com/office/drawing/2016/5/12/chartex" xmlns:cx7="http://schemas.microsoft.com/office/drawing/2016/5/13/chartex" xmlns:cx8="http://schemas.microsoft.com/office/drawing/2016/5/14/chartex" xmlns:aink="http://schemas.microsoft.com/office/drawing/2016/ink" xmlns:am3d="http://schemas.microsoft.com/office/drawing/2017/model3d" xmlns:w16cex="http://schemas.microsoft.com/office/word/2018/wordml/cex" xmlns:w16cid="http://schemas.microsoft.com/office/word/2016/wordml/cid" xmlns:w16="http://schemas.microsoft.com/office/word/2018/wordml" xmlns:w16sdtdh="http://schemas.microsoft.com/office/word/2020/wordml/sdtdatahash" xmlns:w16se="http://schemas.microsoft.com/office/word/2015/wordml/symex" mc:Ignorable="w14 w15 wp14">
   <w:body>
     <w:p>
-      <w:r>
+      <w:pPr>
+        <w:rPr>
+          <w:i/>
+          <w:iCs/>
+        </w:rPr>
+      </w:pPr>
+      <w:r>
+        <w:rPr>
+          <w:i/>
+          <w:iCs/>
+        </w:rPr>
         <w:t xml:space="preserve">
   Helloword
   </w:t>
       </w:r>
       <w:r>
         <w:rPr>
+          <w:i/>
+          <w:iCs/>
           <w:color w:val="FF0000"/>
         </w:rPr>
         <w:r>
           <w:rPr>
+            <w:i/>
+            <w:iCs/>
             <w:color w:val="FF0000"/>
           </w:rPr>
           <w:t xml:space="preserve">color</w:t>
         </w:r>
       </w:r>
       <w:r>
-        <w:t xml:space="preserve">
-  </w:t>
-      </w:r>
-      <w:r>
-        <w:rPr>
+        <w:rPr>
+          <w:i/>
+          <w:iCs/>
+        </w:rPr>
+        <w:t xml:space="preserve">
+  </w:t>
+      </w:r>
+      <w:r>
+        <w:rPr>
+          <w:i/>
+          <w:iCs/>
           <w:sz w:val="30"/>
           <w:szCs w:val="30"/>
         </w:rPr>
         <w:r>
           <w:rPr>
+            <w:i/>
+            <w:iCs/>
             <w:sz w:val="30"/>
             <w:szCs w:val="30"/>
           </w:rPr>
@@ -37,6 +59,10 @@
         </w:r>
       </w:r>
       <w:r>
+        <w:rPr>
+          <w:i/>
+          <w:iCs/>
+        </w:rPr>
         <w:t xml:space="preserve">
   </w:t>
       </w:r>
@@ -44,16 +70,24 @@
         <w:rPr>
           <w:b/>
           <w:bCs/>
+          <w:i/>
+          <w:iCs/>
         </w:rPr>
         <w:r>
           <w:rPr>
             <w:b/>
             <w:bCs/>
+            <w:i/>
+            <w:iCs/>
           </w:rPr>
           <w:t xml:space="preserve">bold</w:t>
         </w:r>
       </w:r>
       <w:r>
+        <w:rPr>
+          <w:i/>
+          <w:iCs/>
+        </w:rPr>
         <w:t xml:space="preserve">
   </w:t>
       </w:r>
@@ -71,72 +105,118 @@
         </w:r>
       </w:r>
       <w:r>
-        <w:t xml:space="preserve">
-  </w:t>
-      </w:r>
-      <w:r>
-        <w:rPr>
+        <w:rPr>
+          <w:i/>
+          <w:iCs/>
+        </w:rPr>
+        <w:t xml:space="preserve">
+  </w:t>
+      </w:r>
+      <w:r>
+        <w:rPr>
+          <w:i/>
+          <w:iCs/>
           <w:u w:val="single" w:color="auto"/>
         </w:rPr>
         <w:r>
           <w:rPr>
+            <w:i/>
+            <w:iCs/>
             <w:u w:val="single" w:color="auto"/>
           </w:rPr>
           <w:t xml:space="preserve">underline</w:t>
         </w:r>
       </w:r>
       <w:r>
-        <w:t xml:space="preserve">
-  </w:t>
-      </w:r>
-      <w:r>
-        <w:rPr>
+        <w:rPr>
+          <w:i/>
+          <w:iCs/>
+        </w:rPr>
+        <w:t xml:space="preserve">
+  </w:t>
+      </w:r>
+      <w:r>
+        <w:rPr>
+          <w:i/>
+          <w:iCs/>
           <w:strike/>
         </w:rPr>
         <w:r>
           <w:rPr>
+            <w:i/>
+            <w:iCs/>
             <w:strike/>
           </w:rPr>
           <w:t xml:space="preserve">line-through</w:t>
         </w:r>
       </w:r>
       <w:r>
-        <w:t xml:space="preserve">
-  </w:t>
-      </w:r>
-      <w:r>
-        <w:rPr>
+        <w:rPr>
+          <w:i/>
+          <w:iCs/>
+        </w:rPr>
+        <w:t xml:space="preserve">
+  </w:t>
+      </w:r>
+      <w:r>
+        <w:rPr>
+          <w:i/>
+          <w:iCs/>
           <w:vertAlign w:val="superscript"/>
         </w:rPr>
         <w:r>
           <w:rPr>
+            <w:i/>
+            <w:iCs/>
             <w:vertAlign w:val="superscript"/>
           </w:rPr>
           <w:t xml:space="preserve">superscript</w:t>
         </w:r>
       </w:r>
       <w:r>
-        <w:t xml:space="preserve">
-  </w:t>
-      </w:r>
-      <w:r>
-        <w:rPr>
+        <w:rPr>
+          <w:i/>
+          <w:iCs/>
+        </w:rPr>
+        <w:t xml:space="preserve">
+  </w:t>
+      </w:r>
+      <w:r>
+        <w:rPr>
+          <w:i/>
+          <w:iCs/>
           <w:vertAlign w:val="subscript"/>
         </w:rPr>
         <w:r>
           <w:rPr>
+            <w:i/>
+            <w:iCs/>
             <w:vertAlign w:val="subscript"/>
           </w:rPr>
           <w:t xml:space="preserve">subscript</w:t>
         </w:r>
       </w:r>
       <w:r>
+        <w:rPr>
+          <w:i/>
+          <w:iCs/>
+        </w:rPr>
         <w:t xml:space="preserve">
 </w:t>
       </w:r>
     </w:p>
     <w:p>
-      <w:r>
+      <w:pPr>
+        <w:rPr>
+          <w:i/>
+          <w:iCs/>
+        </w:rPr>
+      </w:pPr>
+      <w:r>
+        <w:rPr>
+          <w:i/>
+          <w:iCs/>
+        </w:rPr>
         <w:t xml:space="preserve">
   Helloword 2
   </w:t>
@@ -145,16 +225,24 @@
         <w:rPr>
           <w:b/>
           <w:bCs/>
+          <w:i/>
+          <w:iCs/>
         </w:rPr>
         <w:r>
           <w:rPr>
             <w:b/>
             <w:bCs/>
+            <w:i/>
+            <w:iCs/>
           </w:rPr>
           <w:t xml:space="preserve">bold with b</w:t>
         </w:r>
       </w:r>
       <w:r>
+        <w:rPr>
+          <w:i/>
+          <w:iCs/>
+        </w:rPr>
         <w:t xml:space="preserve">
   </w:t>
       </w:r>
@@ -162,16 +250,24 @@
         <w:rPr>
           <w:b/>
           <w:bCs/>
+          <w:i/>
+          <w:iCs/>
         </w:rPr>
         <w:r>
           <w:rPr>
             <w:b/>
             <w:bCs/>
+            <w:i/>
+            <w:iCs/>
           </w:rPr>
           <w:t xml:space="preserve">bold with strong</w:t>
         </w:r>
       </w:r>
       <w:r>
+        <w:rPr>
+          <w:i/>
+          <w:iCs/>
+        </w:rPr>
         <w:t xml:space="preserve">
   </w:t>
       </w:r>
@@ -189,6 +285,10 @@
         </w:r>
       </w:r>
       <w:r>
+        <w:rPr>
+          <w:i/>
+          <w:iCs/>
+        </w:rPr>
         <w:t xml:space="preserve">
   </w:t>
       </w:r>
@@ -206,80 +306,126 @@
         </w:r>
       </w:r>
       <w:r>
-        <w:t xml:space="preserve">
-  </w:t>
-      </w:r>
-      <w:r>
-        <w:rPr>
+        <w:rPr>
+          <w:i/>
+          <w:iCs/>
+        </w:rPr>
+        <w:t xml:space="preserve">
+  </w:t>
+      </w:r>
+      <w:r>
+        <w:rPr>
+          <w:i/>
+          <w:iCs/>
           <w:u w:val="single" w:color="auto"/>
         </w:rPr>
         <w:r>
           <w:rPr>
+            <w:i/>
+            <w:iCs/>
             <w:u w:val="single" w:color="auto"/>
           </w:rPr>
           <w:t xml:space="preserve">underline with u</w:t>
         </w:r>
       </w:r>
       <w:r>
-        <w:t xml:space="preserve">
-  </w:t>
-      </w:r>
-      <w:r>
-        <w:rPr>
+        <w:rPr>
+          <w:i/>
+          <w:iCs/>
+        </w:rPr>
+        <w:t xml:space="preserve">
+  </w:t>
+      </w:r>
+      <w:r>
+        <w:rPr>
+          <w:i/>
+          <w:iCs/>
           <w:strike/>
         </w:rPr>
         <w:r>
           <w:rPr>
+            <w:i/>
+            <w:iCs/>
             <w:strike/>
           </w:rPr>
           <w:t xml:space="preserve">line-through with strike</w:t>
         </w:r>
       </w:r>
       <w:r>
-        <w:t xml:space="preserve">
-  </w:t>
-      </w:r>
-      <w:r>
-        <w:rPr>
+        <w:rPr>
+          <w:i/>
+          <w:iCs/>
+        </w:rPr>
+        <w:t xml:space="preserve">
+  </w:t>
+      </w:r>
+      <w:r>
+        <w:rPr>
+          <w:i/>
+          <w:iCs/>
           <w:vertAlign w:val="subscript"/>
         </w:rPr>
         <w:r>
           <w:rPr>
+            <w:i/>
+            <w:iCs/>
             <w:vertAlign w:val="subscript"/>
           </w:rPr>
           <w:t xml:space="preserve">subscript with sub</w:t>
         </w:r>
       </w:r>
       <w:r>
-        <w:t xml:space="preserve">
-  </w:t>
-      </w:r>
-      <w:r>
-        <w:rPr>
+        <w:rPr>
+          <w:i/>
+          <w:iCs/>
+        </w:rPr>
+        <w:t xml:space="preserve">
+  </w:t>
+      </w:r>
+      <w:r>
+        <w:rPr>
+          <w:i/>
+          <w:iCs/>
           <w:vertAlign w:val="superscript"/>
         </w:rPr>
         <w:r>
           <w:rPr>
+            <w:i/>
+            <w:iCs/>
             <w:vertAlign w:val="superscript"/>
           </w:rPr>
           <w:t xml:space="preserve">superscript with sup</w:t>
         </w:r>
       </w:r>
       <w:r>
+        <w:rPr>
+          <w:i/>
+          <w:iCs/>
+        </w:rPr>
         <w:t xml:space="preserve">
 </w:t>
       </w:r>
     </w:p>
     <w:p>
+      <w:pPr>
+        <w:rPr>
+          <w:i/>
+          <w:iCs/>
+        </w:rPr>
+      </w:pPr>
       <w:r>
         <w:rPr>
           <w:b/>
           <w:bCs/>
+          <w:i/>
+          <w:iCs/>
         </w:rPr>
         <w:r>
           <w:rPr>
             <w:b/>
             <w:bCs/>
+            <w:i/>
+            <w:iCs/>
           </w:rPr>
           <w:t xml:space="preserve">bold with b</w:t>
         </w:r>
@@ -397,8 +543,16 @@
           <w:ilvl w:val="0"/>
           <w:numId w:val="1"/>
         </w:numPr>
-      </w:pPr>
-      <w:r>
+        <w:rPr>
+          <w:i/>
+          <w:iCs/>
+        </w:rPr>
+      </w:pPr>
+      <w:r>
+        <w:rPr>
+          <w:i/>
+          <w:iCs/>
+        </w:rPr>
         <w:t xml:space="preserve">Item 1</w:t>
       </w:r>
     </w:p>
@@ -409,8 +563,16 @@
           <w:ilvl w:val="0"/>
           <w:numId w:val="1"/>
         </w:numPr>
-      </w:pPr>
-      <w:r>
+        <w:rPr>
+          <w:i/>
+          <w:iCs/>
+        </w:rPr>
+      </w:pPr>
+      <w:r>
+        <w:rPr>
+          <w:i/>
+          <w:iCs/>
+        </w:rPr>
         <w:t xml:space="preserve">Item 2</w:t>
       </w:r>
     </w:p>
@@ -421,8 +583,16 @@
           <w:ilvl w:val="1"/>
           <w:numId w:val="1"/>
         </w:numPr>
-      </w:pPr>
-      <w:r>
+        <w:rPr>
+          <w:i/>
+          <w:iCs/>
+        </w:rPr>
+      </w:pPr>
+      <w:r>
+        <w:rPr>
+          <w:i/>
+          <w:iCs/>
+        </w:rPr>
         <w:t xml:space="preserve">Item 3</w:t>
       </w:r>
     </w:p>
@@ -433,8 +603,16 @@
           <w:ilvl w:val="1"/>
           <w:numId w:val="1"/>
         </w:numPr>
-      </w:pPr>
-      <w:r>
+        <w:rPr>
+          <w:i/>
+          <w:iCs/>
+        </w:rPr>
+      </w:pPr>
+      <w:r>
+        <w:rPr>
+          <w:i/>
+          <w:iCs/>
+        </w:rPr>
         <w:t xml:space="preserve">Item 4</w:t>
       </w:r>
     </w:p>
@@ -445,8 +623,16 @@
           <w:ilvl w:val="2"/>
           <w:numId w:val="2"/>
         </w:numPr>
-      </w:pPr>
-      <w:r>
+        <w:rPr>
+          <w:i/>
+          <w:iCs/>
+        </w:rPr>
+      </w:pPr>
+      <w:r>
+        <w:rPr>
+          <w:i/>
+          <w:iCs/>
+        </w:rPr>
         <w:t xml:space="preserve">Item 5</w:t>
       </w:r>
     </w:p>
@@ -457,8 +643,16 @@
           <w:ilvl w:val="2"/>
           <w:numId w:val="2"/>
         </w:numPr>
-      </w:pPr>
-      <w:r>
+        <w:rPr>
+          <w:i/>
+          <w:iCs/>
+        </w:rPr>
+      </w:pPr>
+      <w:r>
+        <w:rPr>
+          <w:i/>
+          <w:iCs/>
+        </w:rPr>
         <w:t xml:space="preserve">Item 6</w:t>
       </w:r>
     </w:p>
@@ -469,8 +663,16 @@
           <w:ilvl w:val="0"/>
           <w:numId w:val="2"/>
         </w:numPr>
-      </w:pPr>
-      <w:r>
+        <w:rPr>
+          <w:i/>
+          <w:iCs/>
+        </w:rPr>
+      </w:pPr>
+      <w:r>
+        <w:rPr>
+          <w:i/>
+          <w:iCs/>
+        </w:rPr>
         <w:t xml:space="preserve">Item 7</w:t>
       </w:r>
     </w:p>
@@ -481,8 +683,16 @@
           <w:ilvl w:val="0"/>
           <w:numId w:val="2"/>
         </w:numPr>
-      </w:pPr>
-      <w:r>
+        <w:rPr>
+          <w:i/>
+          <w:iCs/>
+        </w:rPr>
+      </w:pPr>
+      <w:r>
+        <w:rPr>
+          <w:i/>
+          <w:iCs/>
+        </w:rPr>
         <w:t xml:space="preserve">Item 8</w:t>
       </w:r>
     </w:p>
@@ -493,8 +703,16 @@
           <w:ilvl w:val="1"/>
           <w:numId w:val="2"/>
         </w:numPr>
-      </w:pPr>
-      <w:r>
+        <w:rPr>
+          <w:i/>
+          <w:iCs/>
+        </w:rPr>
+      </w:pPr>
+      <w:r>
+        <w:rPr>
+          <w:i/>
+          <w:iCs/>
+        </w:rPr>
         <w:t xml:space="preserve">Item 9</w:t>
       </w:r>
     </w:p>
@@ -505,13 +723,31 @@
           <w:ilvl w:val="1"/>
           <w:numId w:val="2"/>
         </w:numPr>
-      </w:pPr>
-      <w:r>
+        <w:rPr>
+          <w:i/>
+          <w:iCs/>
+        </w:rPr>
+      </w:pPr>
+      <w:r>
+        <w:rPr>
+          <w:i/>
+          <w:iCs/>
+        </w:rPr>
         <w:t xml:space="preserve">Item 10</w:t>
       </w:r>
     </w:p>
     <w:p>
-      <w:r>
+      <w:pPr>
+        <w:rPr>
+          <w:i/>
+          <w:iCs/>
+        </w:rPr>
+      </w:pPr>
+      <w:r>
+        <w:rPr>
+          <w:i/>
+          <w:iCs/>
+        </w:rPr>
         <w:t xml:space="preserve">
   </w:t>
       </w:r>
@@ -556,19 +792,41 @@
         </w:drawing>
       </w:r>
       <w:r>
-        <w:t xml:space="preserve">
-  </w:t>
-      </w:r>
-      <w:r>
+        <w:rPr>
+          <w:i/>
+          <w:iCs/>
+        </w:rPr>
+        <w:t xml:space="preserve">
+  </w:t>
+      </w:r>
+      <w:r>
+        <w:rPr>
+          <w:i/>
+          <w:iCs/>
+        </w:rPr>
         <w:t xml:space="preserve">[Image not found: testimagedhd]</w:t>
       </w:r>
       <w:r>
+        <w:rPr>
+          <w:i/>
+          <w:iCs/>
+        </w:rPr>
         <w:t xml:space="preserve">
 </w:t>
       </w:r>
     </w:p>
     <w:p>
-      <w:r>
+      <w:pPr>
+        <w:rPr>
+          <w:i/>
+          <w:iCs/>
+        </w:rPr>
+      </w:pPr>
+      <w:r>
+        <w:rPr>
+          <w:i/>
+          <w:iCs/>
+        </w:rPr>
         <w:t xml:space="preserve">
   test image floating left
   </w:t>
@@ -622,13 +880,27 @@
         </w:drawing>
       </w:r>
       <w:r>
+        <w:rPr>
+          <w:i/>
+          <w:iCs/>
+        </w:rPr>
         <w:t xml:space="preserve">
   Lorem ipsum dolor sit amet, consectetur adipiscing elit. Sed non risus. Suspendisse lectus tortor, dignissim sit amet, adipiscing nec, ultricies sed, dolor. Cras elementum ultrices diam. Maecenas ligula massa.
 </w:t>
       </w:r>
     </w:p>
     <w:p>
-      <w:r>
+      <w:pPr>
+        <w:rPr>
+          <w:i/>
+          <w:iCs/>
+        </w:rPr>
+      </w:pPr>
+      <w:r>
+        <w:rPr>
+          <w:i/>
+          <w:iCs/>
+        </w:rPr>
         <w:t xml:space="preserve">
   test image floating right
   </w:t>
@@ -682,6 +954,10 @@
         </w:drawing>
       </w:r>
       <w:r>
+        <w:rPr>
+          <w:i/>
+          <w:iCs/>
+        </w:rPr>
         <w:t xml:space="preserve">
   Lorem ipsum dolor sit amet, consectetur adipiscing elit. Sed non risus. Suspendisse lectus tortor, dignissim sit amet, adipiscing nec, ultricies sed, dolor. Cras elementum ultrices diam. Maecenas ligula massa.
 </w:t>

</xml_diff>